<commit_message>
Avenue 28 step 4: Tao's reduction is p = 1/2-specific; positive pairing majorant is borderline for p = 1/4
- Correction: Tao's §7 (polynomial Fourier decay) works for any geometric law, but his §6 (Fourier decay =>
  fine-scale mixing) uses h(1/2) = 1 bit per unit of 2-adic size. For p = 1/4 the collision-entropy step loses
  2^(0.30n), so absolute continuity of the Applegate-Lagarias limit measure would need exponential decay of nu^
  below 2^(-1/4) = 0.84 per level (observed 0.64). Corrected in notes/limit_function.md, AVENUES §28, preimage.md
  Remark 1, CLAUDE.md.
- fourier_majorant.py: Tao's pairing as a positive majorant decays at 0.78 per level on even n but 0.85 on odd n
  (n <= 15): borderline. Next levers recorded (triples, a sharper §6 split, bounds on black triangles).

Co-Authored-By: Claude Opus 5.5 <noreply@anthropic.com>
</commit_message>
<xml_diff>
--- a/paper/preimage.docx
+++ b/paper/preimage.docx
@@ -12518,7 +12518,24 @@
           <w:sz w:val="22"/>
           <w:szCs w:val="22"/>
         </w:rPr>
-        <w:t xml:space="preserve"> has L² norm 1.0356 &gt; 1. Its m-step norms are below 1 at each finite level but grow with the level. So the decay is arithmetic, not a contraction property, and no finite operator-norm certificate can prove it. - Tao's proof of fine-scale mixing for p = 1/2 [T, §§6–7] appears to use p only through constants. Given a + a′ = b, the split is uniform for every geometric law. If it transfers, ν is absolutely continuous, so that W</w:t>
+        <w:t xml:space="preserve"> has L² norm 1.0356 &gt; 1. Its m-step norms are below 1 at each finite level but grow with the level. So the decay is arithmetic, not a contraction property, and no finite operator-norm certificate can prove it. - Tao's proof of fine-scale mixing for p = 1/2 [T, §§6–7] does not transfer directly. His Fourier-decay part (§7) works for any geometric law, but his reduction to mixing (§6) uses that Geom(2) has exactly one bit of entropy per unit of 2-adic size. For p = 1/4 that reduction would need exponential decay of ν̂, at rate below 2</w:t>
+      </w:r>
+      <w:r>
+        <w:rPr>
+          <w:rFonts w:ascii="Georgia" w:cs="Georgia" w:eastAsia="Georgia" w:hAnsi="Georgia"/>
+          <w:sz w:val="22"/>
+          <w:szCs w:val="22"/>
+          <w:vertAlign w:val="superscript"/>
+        </w:rPr>
+        <w:t xml:space="preserve">−1/4</w:t>
+      </w:r>
+      <w:r>
+        <w:rPr>
+          <w:rFonts w:ascii="Georgia" w:cs="Georgia" w:eastAsia="Georgia" w:hAnsi="Georgia"/>
+          <w:sz w:val="22"/>
+          <w:szCs w:val="22"/>
+        </w:rPr>
+        <w:t xml:space="preserve"> per level, against an observed 0.64. With it, ν is absolutely continuous, so W</w:t>
       </w:r>
       <w:r>
         <w:rPr>

</xml_diff>